<commit_message>
fix(api): strip docx producer metadata
</commit_message>
<xml_diff>
--- a/services/api/assets/source-contract-templates/equipment-rental-source.docx
+++ b/services/api/assets/source-contract-templates/equipment-rental-source.docx
@@ -1,6 +1,6 @@
 
 <file path=word/document.xml><?xml version="1.0" encoding="utf-8"?>
-<w:document xmlns:wpc="http://schemas.microsoft.com/office/word/2010/wordprocessingCanvas" xmlns:mc="http://schemas.openxmlformats.org/markup-compatibility/2006" xmlns:o="urn:schemas-microsoft-com:office:office" xmlns:r="http://schemas.openxmlformats.org/officeDocument/2006/relationships" xmlns:m="http://schemas.openxmlformats.org/officeDocument/2006/math" xmlns:v="urn:schemas-microsoft-com:vml" xmlns:wp14="http://schemas.microsoft.com/office/word/2010/wordprocessingDrawing" xmlns:wp="http://schemas.openxmlformats.org/drawingml/2006/wordprocessingDrawing" xmlns:w="http://schemas.openxmlformats.org/wordprocessingml/2006/main" xmlns:w14="http://schemas.microsoft.com/office/word/2010/wordml" xmlns:w10="urn:schemas-microsoft-com:office:word" xmlns:w15="http://schemas.microsoft.com/office/word/2012/wordml" xmlns:wpg="http://schemas.microsoft.com/office/word/2010/wordprocessingGroup" xmlns:wpi="http://schemas.microsoft.com/office/word/2010/wordprocessingInk" xmlns:wne="http://schemas.microsoft.com/office/word/2006/wordml" xmlns:wps="http://schemas.microsoft.com/office/word/2010/wordprocessingShape" xmlns:wpsCustomData="http://www.wps.cn/officeDocument/2013/wpsCustomData" mc:Ignorable="w14 w15 wp14">
+<w:document xmlns:wpc="http://schemas.microsoft.com/office/word/2010/wordprocessingCanvas" xmlns:mc="http://schemas.openxmlformats.org/markup-compatibility/2006" xmlns:o="urn:schemas-microsoft-com:office:office" xmlns:r="http://schemas.openxmlformats.org/officeDocument/2006/relationships" xmlns:m="http://schemas.openxmlformats.org/officeDocument/2006/math" xmlns:v="urn:schemas-microsoft-com:vml" xmlns:wp14="http://schemas.microsoft.com/office/word/2010/wordprocessingDrawing" xmlns:wp="http://schemas.openxmlformats.org/drawingml/2006/wordprocessingDrawing" xmlns:w="http://schemas.openxmlformats.org/wordprocessingml/2006/main" xmlns:w14="http://schemas.microsoft.com/office/word/2010/wordml" xmlns:w10="urn:schemas-microsoft-com:office:word" xmlns:w15="http://schemas.microsoft.com/office/word/2012/wordml" xmlns:wpg="http://schemas.microsoft.com/office/word/2010/wordprocessingGroup" xmlns:wpi="http://schemas.microsoft.com/office/word/2010/wordprocessingInk" xmlns:wne="http://schemas.microsoft.com/office/word/2006/wordml" xmlns:wps="http://schemas.microsoft.com/office/word/2010/wordprocessingShape" mc:Ignorable="w14 w15 wp14">
   <w:body>
     <w:p>
       <w:pPr>
@@ -18908,7 +18908,7 @@
 </file>
 
 <file path=word/footer1.xml><?xml version="1.0" encoding="utf-8"?>
-<w:ftr xmlns:wpc="http://schemas.microsoft.com/office/word/2010/wordprocessingCanvas" xmlns:mc="http://schemas.openxmlformats.org/markup-compatibility/2006" xmlns:o="urn:schemas-microsoft-com:office:office" xmlns:r="http://schemas.openxmlformats.org/officeDocument/2006/relationships" xmlns:m="http://schemas.openxmlformats.org/officeDocument/2006/math" xmlns:v="urn:schemas-microsoft-com:vml" xmlns:wp14="http://schemas.microsoft.com/office/word/2010/wordprocessingDrawing" xmlns:wp="http://schemas.openxmlformats.org/drawingml/2006/wordprocessingDrawing" xmlns:w10="urn:schemas-microsoft-com:office:word" xmlns:w="http://schemas.openxmlformats.org/wordprocessingml/2006/main" xmlns:w14="http://schemas.microsoft.com/office/word/2010/wordml" xmlns:w15="http://schemas.microsoft.com/office/word/2012/wordml" xmlns:wpg="http://schemas.microsoft.com/office/word/2010/wordprocessingGroup" xmlns:wpi="http://schemas.microsoft.com/office/word/2010/wordprocessingInk" xmlns:wne="http://schemas.microsoft.com/office/word/2006/wordml" xmlns:wps="http://schemas.microsoft.com/office/word/2010/wordprocessingShape" xmlns:wpsCustomData="http://www.wps.cn/officeDocument/2013/wpsCustomData" mc:Ignorable="w14 w15 wp14">
+<w:ftr xmlns:wpc="http://schemas.microsoft.com/office/word/2010/wordprocessingCanvas" xmlns:mc="http://schemas.openxmlformats.org/markup-compatibility/2006" xmlns:o="urn:schemas-microsoft-com:office:office" xmlns:r="http://schemas.openxmlformats.org/officeDocument/2006/relationships" xmlns:m="http://schemas.openxmlformats.org/officeDocument/2006/math" xmlns:v="urn:schemas-microsoft-com:vml" xmlns:wp14="http://schemas.microsoft.com/office/word/2010/wordprocessingDrawing" xmlns:wp="http://schemas.openxmlformats.org/drawingml/2006/wordprocessingDrawing" xmlns:w10="urn:schemas-microsoft-com:office:word" xmlns:w="http://schemas.openxmlformats.org/wordprocessingml/2006/main" xmlns:w14="http://schemas.microsoft.com/office/word/2010/wordml" xmlns:w15="http://schemas.microsoft.com/office/word/2012/wordml" xmlns:wpg="http://schemas.microsoft.com/office/word/2010/wordprocessingGroup" xmlns:wpi="http://schemas.microsoft.com/office/word/2010/wordprocessingInk" xmlns:wne="http://schemas.microsoft.com/office/word/2006/wordml" xmlns:wps="http://schemas.microsoft.com/office/word/2010/wordprocessingShape" mc:Ignorable="w14 w15 wp14">
   <w:p>
     <w:pPr>
       <w:pStyle w:val="12"/>
@@ -19038,7 +19038,7 @@
 </file>
 
 <file path=word/header1.xml><?xml version="1.0" encoding="utf-8"?>
-<w:hdr xmlns:wpc="http://schemas.microsoft.com/office/word/2010/wordprocessingCanvas" xmlns:mc="http://schemas.openxmlformats.org/markup-compatibility/2006" xmlns:o="urn:schemas-microsoft-com:office:office" xmlns:r="http://schemas.openxmlformats.org/officeDocument/2006/relationships" xmlns:m="http://schemas.openxmlformats.org/officeDocument/2006/math" xmlns:v="urn:schemas-microsoft-com:vml" xmlns:wp14="http://schemas.microsoft.com/office/word/2010/wordprocessingDrawing" xmlns:wp="http://schemas.openxmlformats.org/drawingml/2006/wordprocessingDrawing" xmlns:w10="urn:schemas-microsoft-com:office:word" xmlns:w="http://schemas.openxmlformats.org/wordprocessingml/2006/main" xmlns:w14="http://schemas.microsoft.com/office/word/2010/wordml" xmlns:w15="http://schemas.microsoft.com/office/word/2012/wordml" xmlns:wpg="http://schemas.microsoft.com/office/word/2010/wordprocessingGroup" xmlns:wpi="http://schemas.microsoft.com/office/word/2010/wordprocessingInk" xmlns:wne="http://schemas.microsoft.com/office/word/2006/wordml" xmlns:wps="http://schemas.microsoft.com/office/word/2010/wordprocessingShape" xmlns:wpsCustomData="http://www.wps.cn/officeDocument/2013/wpsCustomData" mc:Ignorable="w14 w15 wp14">
+<w:hdr xmlns:wpc="http://schemas.microsoft.com/office/word/2010/wordprocessingCanvas" xmlns:mc="http://schemas.openxmlformats.org/markup-compatibility/2006" xmlns:o="urn:schemas-microsoft-com:office:office" xmlns:r="http://schemas.openxmlformats.org/officeDocument/2006/relationships" xmlns:m="http://schemas.openxmlformats.org/officeDocument/2006/math" xmlns:v="urn:schemas-microsoft-com:vml" xmlns:wp14="http://schemas.microsoft.com/office/word/2010/wordprocessingDrawing" xmlns:wp="http://schemas.openxmlformats.org/drawingml/2006/wordprocessingDrawing" xmlns:w10="urn:schemas-microsoft-com:office:word" xmlns:w="http://schemas.openxmlformats.org/wordprocessingml/2006/main" xmlns:w14="http://schemas.microsoft.com/office/word/2010/wordml" xmlns:w15="http://schemas.microsoft.com/office/word/2012/wordml" xmlns:wpg="http://schemas.microsoft.com/office/word/2010/wordprocessingGroup" xmlns:wpi="http://schemas.microsoft.com/office/word/2010/wordprocessingInk" xmlns:wne="http://schemas.microsoft.com/office/word/2006/wordml" xmlns:wps="http://schemas.microsoft.com/office/word/2010/wordprocessingShape" mc:Ignorable="w14 w15 wp14">
   <w:p>
     <w:pPr>
       <w:pStyle w:val="13"/>
@@ -19049,7 +19049,7 @@
 </file>
 
 <file path=word/styles.xml><?xml version="1.0" encoding="utf-8"?>
-<w:styles xmlns:mc="http://schemas.openxmlformats.org/markup-compatibility/2006" xmlns:o="urn:schemas-microsoft-com:office:office" xmlns:r="http://schemas.openxmlformats.org/officeDocument/2006/relationships" xmlns:m="http://schemas.openxmlformats.org/officeDocument/2006/math" xmlns:v="urn:schemas-microsoft-com:vml" xmlns:w="http://schemas.openxmlformats.org/wordprocessingml/2006/main" xmlns:w14="http://schemas.microsoft.com/office/word/2010/wordml" xmlns:w10="urn:schemas-microsoft-com:office:word" xmlns:sl="http://schemas.openxmlformats.org/schemaLibrary/2006/main" xmlns:wpsCustomData="http://www.wps.cn/officeDocument/2013/wpsCustomData" mc:Ignorable="w14">
+<w:styles xmlns:mc="http://schemas.openxmlformats.org/markup-compatibility/2006" xmlns:o="urn:schemas-microsoft-com:office:office" xmlns:r="http://schemas.openxmlformats.org/officeDocument/2006/relationships" xmlns:m="http://schemas.openxmlformats.org/officeDocument/2006/math" xmlns:v="urn:schemas-microsoft-com:vml" xmlns:w="http://schemas.openxmlformats.org/wordprocessingml/2006/main" xmlns:w14="http://schemas.microsoft.com/office/word/2010/wordml" xmlns:w10="urn:schemas-microsoft-com:office:word" xmlns:sl="http://schemas.openxmlformats.org/schemaLibrary/2006/main" mc:Ignorable="w14">
   <w:docDefaults>
     <w:rPrDefault>
       <w:rPr>
@@ -20365,21 +20365,4 @@
   </a:themeElements>
   <a:objectDefaults/>
 </a:theme>
-</file>
-
-<file path=customXml/item1.xml><?xml version="1.0" encoding="utf-8"?>
-<s:customData xmlns="http://www.wps.cn/officeDocument/2013/wpsCustomData" xmlns:s="http://www.wps.cn/officeDocument/2013/wpsCustomData">
-  <customSectProps/>
-  <customShpExts>
-    <customShpInfo spid="_x0000_s1026" textRotate="1"/>
-  </customShpExts>
-</s:customData>
-</file>
-
-<file path=customXml/itemProps1.xml><?xml version="1.0" encoding="utf-8"?>
-<ds:datastoreItem xmlns:ds="http://schemas.openxmlformats.org/officeDocument/2006/customXml" ds:itemID="{B1977F7D-205B-4081-913C-38D41E755F92}">
-  <ds:schemaRefs>
-    <ds:schemaRef ds:uri="http://www.wps.cn/officeDocument/2013/wpsCustomData"/>
-  </ds:schemaRefs>
-</ds:datastoreItem>
 </file>
</xml_diff>